<commit_message>
Add Stage 4 (Network Submission & Response) and Stage 5 (Resolution & Recovery) to consolidated draft
Drafts Section 7 (Fraud submits fraudulent disputes, Payment Services submits
non-fraudulent disputes to Central 1, then monitor/respond per the Everlink
dispute-response-pre-arbitration-arbitration cycle, including the compelling
evidence certification requirement) and Section 8 (record final outcome as
Member/Issuer/Acquirer liable, Payment Services finalizes or reverses the
provisional credit for both fraud and non-fraud cases, then closes the case
and routes back to Growth for member communication). Process Flow sections
left blank per standing instruction to add screenshots manually.

Co-Authored-By: Claude Sonnet 5 <noreply@anthropic.com>
Claude-Session: https://claude.ai/code/session_01Msiz5p6hoKmmUHZyLJTkqb
</commit_message>
<xml_diff>
--- a/Dispute Resolution/DRAFT - Visa Debit Card Dispute Management Process.docx
+++ b/Dispute Resolution/DRAFT - Visa Debit Card Dispute Management Process.docx
@@ -5388,6 +5388,774 @@
     <w:p/>
     <w:p/>
     <w:p/>
+    <w:p>
+      <w:pPr>
+        <w:pStyle w:val="Heading1"/>
+      </w:pPr>
+      <w:r>
+        <w:t>Stage 4: Network Submission &amp; Response (Payment Services / Fraud)</w:t>
+      </w:r>
+    </w:p>
+    <w:p>
+      <w:pPr>
+        <w:pStyle w:val="Heading2"/>
+        <w:numPr>
+          <w:ilvl w:val="0"/>
+          <w:numId w:val="0"/>
+        </w:numPr>
+        <w:ind w:left="851" w:hanging="851"/>
+      </w:pPr>
+      <w:r>
+        <w:t>7.1     Process Flow</w:t>
+      </w:r>
+    </w:p>
+    <w:p>
+      <w:r>
+        <w:t>[Process flow diagram to be added]</w:t>
+      </w:r>
+    </w:p>
+    <w:p>
+      <w:pPr>
+        <w:pStyle w:val="Heading2"/>
+        <w:numPr>
+          <w:ilvl w:val="0"/>
+          <w:numId w:val="0"/>
+        </w:numPr>
+        <w:ind w:left="851" w:hanging="851"/>
+      </w:pPr>
+      <w:r>
+        <w:t>7.2     Procedure</w:t>
+      </w:r>
+    </w:p>
+    <w:p>
+      <w:r>
+        <w:t>The following procedure provides a step-by-step outline of the activities performed by the Fraud Prevention Department or Payment Services Team as part of network submission and response.</w:t>
+      </w:r>
+    </w:p>
+    <w:p>
+      <w:pPr>
+        <w:pStyle w:val="Heading3"/>
+        <w:numPr>
+          <w:ilvl w:val="0"/>
+          <w:numId w:val="0"/>
+        </w:numPr>
+        <w:ind w:left="992" w:hanging="992"/>
+      </w:pPr>
+      <w:r>
+        <w:rPr>
+          <w:sz w:val="28"/>
+        </w:rPr>
+        <w:t>7.2.1 Submit the Dispute to Central 1</w:t>
+      </w:r>
+    </w:p>
+    <w:p>
+      <w:r>
+        <w:t>Once the case has met the applicable network submission requirements (see Section 6.2.4), the dispute should be submitted to Central 1 for onward submission to Visa:</w:t>
+      </w:r>
+    </w:p>
+    <w:p>
+      <w:pPr>
+        <w:pStyle w:val="ListParagraph"/>
+        <w:numPr>
+          <w:ilvl w:val="0"/>
+          <w:numId w:val="900"/>
+        </w:numPr>
+        <w:contextualSpacing w:val="0"/>
+      </w:pPr>
+      <w:r>
+        <w:rPr>
+          <w:b/>
+          <w:i w:val="0"/>
+        </w:rPr>
+        <w:t xml:space="preserve">Fraud Prevention Department: </w:t>
+      </w:r>
+      <w:r>
+        <w:t>submit fraudulent disputes to Central 1.</w:t>
+      </w:r>
+    </w:p>
+    <w:p>
+      <w:pPr>
+        <w:pStyle w:val="ListParagraph"/>
+        <w:numPr>
+          <w:ilvl w:val="0"/>
+          <w:numId w:val="900"/>
+        </w:numPr>
+        <w:contextualSpacing w:val="0"/>
+      </w:pPr>
+      <w:r>
+        <w:rPr>
+          <w:b/>
+          <w:i w:val="0"/>
+        </w:rPr>
+        <w:t xml:space="preserve">Payment Services Team: </w:t>
+      </w:r>
+      <w:r>
+        <w:t>submit non-fraudulent disputes to Central 1.</w:t>
+      </w:r>
+    </w:p>
+    <w:p>
+      <w:r>
+        <w:rPr>
+          <w:b w:val="0"/>
+          <w:i/>
+        </w:rPr>
+        <w:t xml:space="preserve">Please refer to the Current Process — How to Initiate an ATM &amp; POS Trace </w:t>
+      </w:r>
+      <w:r>
+        <w:rPr>
+          <w:b w:val="0"/>
+          <w:i w:val="0"/>
+        </w:rPr>
+        <w:t>for detailed guidance on completing the submission form.</w:t>
+      </w:r>
+    </w:p>
+    <w:p>
+      <w:r>
+        <w:t>Once submitted, set the CRM case status to “Submitted to Central 1”.</w:t>
+      </w:r>
+    </w:p>
+    <w:p>
+      <w:pPr>
+        <w:pStyle w:val="Heading3"/>
+        <w:numPr>
+          <w:ilvl w:val="0"/>
+          <w:numId w:val="0"/>
+        </w:numPr>
+        <w:ind w:left="992" w:hanging="992"/>
+      </w:pPr>
+      <w:r>
+        <w:rPr>
+          <w:sz w:val="28"/>
+        </w:rPr>
+        <w:t>7.2.2 Monitor and Respond to Network Submission</w:t>
+      </w:r>
+    </w:p>
+    <w:p>
+      <w:r>
+        <w:t>Once the dispute has been submitted, the Fraud Prevention Department or Payment Services Team should monitor for a response from Central 1 via email, and respond within the applicable timeframes. The table below provides a high-level summary of the dispute cycle (please refer to the Everlink — Visa Debit Program Chargeback User Guide for full detail):</w:t>
+      </w:r>
+    </w:p>
+    <w:tbl>
+      <w:tblPr>
+        <w:tblStyle w:val="TealFINAL"/>
+        <w:tblW w:type="auto" w:w="0"/>
+        <w:tblLook w:firstColumn="1" w:firstRow="1" w:lastColumn="0" w:lastRow="0" w:noHBand="0" w:noVBand="1" w:val="04A0"/>
+      </w:tblPr>
+      <w:tblGrid>
+        <w:gridCol w:w="2340"/>
+        <w:gridCol w:w="2340"/>
+        <w:gridCol w:w="2340"/>
+        <w:gridCol w:w="2340"/>
+      </w:tblGrid>
+      <w:tr>
+        <w:tc>
+          <w:tcPr>
+            <w:tcW w:type="dxa" w:w="2340"/>
+          </w:tcPr>
+          <w:p>
+            <w:r/>
+            <w:r>
+              <w:rPr>
+                <w:b/>
+              </w:rPr>
+              <w:t>Step</w:t>
+            </w:r>
+          </w:p>
+        </w:tc>
+        <w:tc>
+          <w:tcPr>
+            <w:tcW w:type="dxa" w:w="2340"/>
+          </w:tcPr>
+          <w:p>
+            <w:r/>
+            <w:r>
+              <w:rPr>
+                <w:b/>
+              </w:rPr>
+              <w:t>Fraud (Dispute Category 10)</w:t>
+            </w:r>
+          </w:p>
+        </w:tc>
+        <w:tc>
+          <w:tcPr>
+            <w:tcW w:type="dxa" w:w="2340"/>
+          </w:tcPr>
+          <w:p>
+            <w:r/>
+            <w:r>
+              <w:rPr>
+                <w:b/>
+              </w:rPr>
+              <w:t>Non-Fraud (Dispute Category 12/13)</w:t>
+            </w:r>
+          </w:p>
+        </w:tc>
+        <w:tc>
+          <w:tcPr>
+            <w:tcW w:type="dxa" w:w="2340"/>
+          </w:tcPr>
+          <w:p>
+            <w:r/>
+            <w:r>
+              <w:rPr>
+                <w:b/>
+              </w:rPr>
+              <w:t>Timeframe</w:t>
+            </w:r>
+          </w:p>
+        </w:tc>
+      </w:tr>
+      <w:tr>
+        <w:tc>
+          <w:tcPr>
+            <w:tcW w:type="dxa" w:w="2340"/>
+          </w:tcPr>
+          <w:p>
+            <w:r/>
+            <w:r>
+              <w:rPr>
+                <w:b w:val="0"/>
+              </w:rPr>
+              <w:t>1. Dispute</w:t>
+            </w:r>
+          </w:p>
+        </w:tc>
+        <w:tc>
+          <w:tcPr>
+            <w:tcW w:type="dxa" w:w="2340"/>
+          </w:tcPr>
+          <w:p>
+            <w:r/>
+            <w:r>
+              <w:rPr>
+                <w:b w:val="0"/>
+              </w:rPr>
+              <w:t>Issuer (Beem) files the dispute</w:t>
+            </w:r>
+          </w:p>
+        </w:tc>
+        <w:tc>
+          <w:tcPr>
+            <w:tcW w:type="dxa" w:w="2340"/>
+          </w:tcPr>
+          <w:p>
+            <w:r/>
+            <w:r>
+              <w:rPr>
+                <w:b w:val="0"/>
+              </w:rPr>
+              <w:t>Issuer (Beem) files the dispute</w:t>
+            </w:r>
+          </w:p>
+        </w:tc>
+        <w:tc>
+          <w:tcPr>
+            <w:tcW w:type="dxa" w:w="2340"/>
+          </w:tcPr>
+          <w:p>
+            <w:r/>
+            <w:r>
+              <w:rPr>
+                <w:b w:val="0"/>
+              </w:rPr>
+              <w:t>Completed in Section 7.2.1</w:t>
+            </w:r>
+          </w:p>
+        </w:tc>
+      </w:tr>
+      <w:tr>
+        <w:tc>
+          <w:tcPr>
+            <w:tcW w:type="dxa" w:w="2340"/>
+          </w:tcPr>
+          <w:p>
+            <w:r/>
+            <w:r>
+              <w:rPr>
+                <w:b w:val="0"/>
+              </w:rPr>
+              <w:t>2. Dispute Response</w:t>
+            </w:r>
+          </w:p>
+        </w:tc>
+        <w:tc>
+          <w:tcPr>
+            <w:tcW w:type="dxa" w:w="2340"/>
+          </w:tcPr>
+          <w:p>
+            <w:r/>
+            <w:r>
+              <w:rPr>
+                <w:b w:val="0"/>
+              </w:rPr>
+              <w:t>N/A</w:t>
+            </w:r>
+          </w:p>
+        </w:tc>
+        <w:tc>
+          <w:tcPr>
+            <w:tcW w:type="dxa" w:w="2340"/>
+          </w:tcPr>
+          <w:p>
+            <w:r/>
+            <w:r>
+              <w:rPr>
+                <w:b w:val="0"/>
+              </w:rPr>
+              <w:t>Acquirer responds with evidence</w:t>
+            </w:r>
+          </w:p>
+        </w:tc>
+        <w:tc>
+          <w:tcPr>
+            <w:tcW w:type="dxa" w:w="2340"/>
+          </w:tcPr>
+          <w:p>
+            <w:r/>
+            <w:r>
+              <w:rPr>
+                <w:b w:val="0"/>
+              </w:rPr>
+              <w:t>30 calendar days</w:t>
+            </w:r>
+          </w:p>
+        </w:tc>
+      </w:tr>
+      <w:tr>
+        <w:tc>
+          <w:tcPr>
+            <w:tcW w:type="dxa" w:w="2340"/>
+          </w:tcPr>
+          <w:p>
+            <w:r/>
+            <w:r>
+              <w:rPr>
+                <w:b w:val="0"/>
+              </w:rPr>
+              <w:t>3. Pre-Arbitration</w:t>
+            </w:r>
+          </w:p>
+        </w:tc>
+        <w:tc>
+          <w:tcPr>
+            <w:tcW w:type="dxa" w:w="2340"/>
+          </w:tcPr>
+          <w:p>
+            <w:r/>
+            <w:r>
+              <w:rPr>
+                <w:b w:val="0"/>
+              </w:rPr>
+              <w:t>Acquirer provides evidence (may include compelling evidence)</w:t>
+            </w:r>
+          </w:p>
+        </w:tc>
+        <w:tc>
+          <w:tcPr>
+            <w:tcW w:type="dxa" w:w="2340"/>
+          </w:tcPr>
+          <w:p>
+            <w:r/>
+            <w:r>
+              <w:rPr>
+                <w:b w:val="0"/>
+              </w:rPr>
+              <w:t>Issuer (Beem) addresses the Acquirer's dispute response</w:t>
+            </w:r>
+          </w:p>
+        </w:tc>
+        <w:tc>
+          <w:tcPr>
+            <w:tcW w:type="dxa" w:w="2340"/>
+          </w:tcPr>
+          <w:p>
+            <w:r/>
+            <w:r>
+              <w:rPr>
+                <w:b w:val="0"/>
+              </w:rPr>
+              <w:t>30 calendar days</w:t>
+            </w:r>
+          </w:p>
+        </w:tc>
+      </w:tr>
+      <w:tr>
+        <w:tc>
+          <w:tcPr>
+            <w:tcW w:type="dxa" w:w="2340"/>
+          </w:tcPr>
+          <w:p>
+            <w:r/>
+            <w:r>
+              <w:rPr>
+                <w:b w:val="0"/>
+              </w:rPr>
+              <w:t>4. Pre-Arbitration Response</w:t>
+            </w:r>
+          </w:p>
+        </w:tc>
+        <w:tc>
+          <w:tcPr>
+            <w:tcW w:type="dxa" w:w="2340"/>
+          </w:tcPr>
+          <w:p>
+            <w:r/>
+            <w:r>
+              <w:rPr>
+                <w:b w:val="0"/>
+              </w:rPr>
+              <w:t>Issuer (Beem) accepts financial responsibility or declines the evidence</w:t>
+            </w:r>
+          </w:p>
+        </w:tc>
+        <w:tc>
+          <w:tcPr>
+            <w:tcW w:type="dxa" w:w="2340"/>
+          </w:tcPr>
+          <w:p>
+            <w:r/>
+            <w:r>
+              <w:rPr>
+                <w:b w:val="0"/>
+              </w:rPr>
+              <w:t>Acquirer accepts financial responsibility or declines</w:t>
+            </w:r>
+          </w:p>
+        </w:tc>
+        <w:tc>
+          <w:tcPr>
+            <w:tcW w:type="dxa" w:w="2340"/>
+          </w:tcPr>
+          <w:p>
+            <w:r/>
+            <w:r>
+              <w:rPr>
+                <w:b w:val="0"/>
+              </w:rPr>
+              <w:t>30 calendar days (a decline must reach Everlink within 10 business days of receipt of the proof)</w:t>
+            </w:r>
+          </w:p>
+        </w:tc>
+      </w:tr>
+      <w:tr>
+        <w:tc>
+          <w:tcPr>
+            <w:tcW w:type="dxa" w:w="2340"/>
+          </w:tcPr>
+          <w:p>
+            <w:r/>
+            <w:r>
+              <w:rPr>
+                <w:b w:val="0"/>
+              </w:rPr>
+              <w:t>5. Arbitration</w:t>
+            </w:r>
+          </w:p>
+        </w:tc>
+        <w:tc>
+          <w:tcPr>
+            <w:tcW w:type="dxa" w:w="2340"/>
+          </w:tcPr>
+          <w:p>
+            <w:r/>
+            <w:r>
+              <w:rPr>
+                <w:b w:val="0"/>
+              </w:rPr>
+              <w:t>Acquirer may escalate to Visa</w:t>
+            </w:r>
+          </w:p>
+        </w:tc>
+        <w:tc>
+          <w:tcPr>
+            <w:tcW w:type="dxa" w:w="2340"/>
+          </w:tcPr>
+          <w:p>
+            <w:r/>
+            <w:r>
+              <w:rPr>
+                <w:b w:val="0"/>
+              </w:rPr>
+              <w:t>Issuer (Beem) may escalate to Visa</w:t>
+            </w:r>
+          </w:p>
+        </w:tc>
+        <w:tc>
+          <w:tcPr>
+            <w:tcW w:type="dxa" w:w="2340"/>
+          </w:tcPr>
+          <w:p>
+            <w:r/>
+            <w:r>
+              <w:rPr>
+                <w:b w:val="0"/>
+              </w:rPr>
+              <w:t>10 calendar days</w:t>
+            </w:r>
+          </w:p>
+        </w:tc>
+      </w:tr>
+    </w:tbl>
+    <w:p>
+      <w:r>
+        <w:rPr>
+          <w:b/>
+          <w:i/>
+        </w:rPr>
+        <w:t xml:space="preserve">Note — Compelling Evidence: </w:t>
+      </w:r>
+      <w:r>
+        <w:rPr>
+          <w:b w:val="0"/>
+          <w:i/>
+        </w:rPr>
+        <w:t>if the Acquirer provides compelling evidence in support of a Pre-Arbitration Attempt, and the Fraud Prevention Department or Payment Services Team decides to continue disputing the transaction (decline the evidence), they must contact the cardholder to review the evidence, and certify that (a) the contact information provided does not match the cardholder’s information on record, and (b) the cardholder has been contacted and continues to dispute the transaction.</w:t>
+      </w:r>
+    </w:p>
+    <w:p>
+      <w:r>
+        <w:t>Once the network submission and response cycle concludes (e.g., the Acquirer accepts the dispute, Beem accepts the Acquirer’s response, or an Arbitration ruling is received), determine whether liability rests with Beem (the Issuer), the member, or the Acquirer, and proceed to Section 8 — Stage 5: Resolution &amp; Recovery.</w:t>
+      </w:r>
+    </w:p>
+    <w:p>
+      <w:pPr>
+        <w:pStyle w:val="Heading1"/>
+      </w:pPr>
+      <w:r>
+        <w:t>Stage 5: Resolution &amp; Recovery (Payment Services / Fraud)</w:t>
+      </w:r>
+    </w:p>
+    <w:p>
+      <w:pPr>
+        <w:pStyle w:val="Heading2"/>
+        <w:numPr>
+          <w:ilvl w:val="0"/>
+          <w:numId w:val="0"/>
+        </w:numPr>
+        <w:ind w:left="851" w:hanging="851"/>
+      </w:pPr>
+      <w:r>
+        <w:t>8.1     Process Flow</w:t>
+      </w:r>
+    </w:p>
+    <w:p>
+      <w:r>
+        <w:t>[Process flow diagram to be added]</w:t>
+      </w:r>
+    </w:p>
+    <w:p>
+      <w:pPr>
+        <w:pStyle w:val="Heading2"/>
+        <w:numPr>
+          <w:ilvl w:val="0"/>
+          <w:numId w:val="0"/>
+        </w:numPr>
+        <w:ind w:left="851" w:hanging="851"/>
+      </w:pPr>
+      <w:r>
+        <w:t>8.2     Procedure</w:t>
+      </w:r>
+    </w:p>
+    <w:p>
+      <w:r>
+        <w:t>The following procedure provides a step-by-step outline of the activities performed by the Fraud Prevention Department and Payment Services Team as part of resolution and recovery.</w:t>
+      </w:r>
+    </w:p>
+    <w:p>
+      <w:pPr>
+        <w:pStyle w:val="Heading3"/>
+        <w:numPr>
+          <w:ilvl w:val="0"/>
+          <w:numId w:val="0"/>
+        </w:numPr>
+        <w:ind w:left="992" w:hanging="992"/>
+      </w:pPr>
+      <w:r>
+        <w:rPr>
+          <w:sz w:val="28"/>
+        </w:rPr>
+        <w:t>8.2.1 Record the Final Outcome</w:t>
+      </w:r>
+    </w:p>
+    <w:p>
+      <w:r>
+        <w:t>Once the network submission and response cycle has concluded (see Section 7.2.2), the Fraud Prevention Department or Payment Services Team should record the final outcome of the dispute in the CRM case notes. There are three possible outcomes:</w:t>
+      </w:r>
+    </w:p>
+    <w:p>
+      <w:pPr>
+        <w:pStyle w:val="ListParagraph"/>
+        <w:numPr>
+          <w:ilvl w:val="0"/>
+          <w:numId w:val="901"/>
+        </w:numPr>
+        <w:contextualSpacing w:val="0"/>
+      </w:pPr>
+      <w:r>
+        <w:rPr>
+          <w:b/>
+          <w:i w:val="0"/>
+        </w:rPr>
+        <w:t xml:space="preserve">Member Liable: </w:t>
+      </w:r>
+      <w:r>
+        <w:t>the member is responsible for the disputed transaction.</w:t>
+      </w:r>
+    </w:p>
+    <w:p>
+      <w:pPr>
+        <w:pStyle w:val="ListParagraph"/>
+        <w:numPr>
+          <w:ilvl w:val="0"/>
+          <w:numId w:val="901"/>
+        </w:numPr>
+        <w:contextualSpacing w:val="0"/>
+      </w:pPr>
+      <w:r>
+        <w:rPr>
+          <w:b/>
+          <w:i w:val="0"/>
+        </w:rPr>
+        <w:t xml:space="preserve">Issuer (Beem) Liable: </w:t>
+      </w:r>
+      <w:r>
+        <w:t>Beem is responsible for the disputed transaction.</w:t>
+      </w:r>
+    </w:p>
+    <w:p>
+      <w:pPr>
+        <w:pStyle w:val="ListParagraph"/>
+        <w:numPr>
+          <w:ilvl w:val="0"/>
+          <w:numId w:val="901"/>
+        </w:numPr>
+        <w:contextualSpacing w:val="0"/>
+      </w:pPr>
+      <w:r>
+        <w:rPr>
+          <w:b/>
+          <w:i w:val="0"/>
+        </w:rPr>
+        <w:t xml:space="preserve">Acquirer Liable: </w:t>
+      </w:r>
+      <w:r>
+        <w:t>the Acquirer is responsible for the disputed transaction (e.g., Beem prevailed through Arbitration).</w:t>
+      </w:r>
+    </w:p>
+    <w:p>
+      <w:r>
+        <w:rPr>
+          <w:b/>
+          <w:i w:val="0"/>
+        </w:rPr>
+        <w:t xml:space="preserve">Fraud Prevention Department: </w:t>
+      </w:r>
+      <w:r>
+        <w:t>once the outcome is recorded, route the case to the Payment Services Team to finalize or reverse the provisional credit.</w:t>
+      </w:r>
+    </w:p>
+    <w:p>
+      <w:pPr>
+        <w:pStyle w:val="Heading3"/>
+        <w:numPr>
+          <w:ilvl w:val="0"/>
+          <w:numId w:val="0"/>
+        </w:numPr>
+        <w:ind w:left="992" w:hanging="992"/>
+      </w:pPr>
+      <w:r>
+        <w:rPr>
+          <w:sz w:val="28"/>
+        </w:rPr>
+        <w:t>8.2.2 Finalize or Reverse the Provisional Credit (Payment Services Team)</w:t>
+      </w:r>
+    </w:p>
+    <w:p>
+      <w:r>
+        <w:t>Based on the recorded outcome, the Payment Services Team should finalize or reverse the provisional credit on the member’s account, for both Fraud and Non-Fraud disputes:</w:t>
+      </w:r>
+    </w:p>
+    <w:p>
+      <w:pPr>
+        <w:pStyle w:val="ListParagraph"/>
+        <w:numPr>
+          <w:ilvl w:val="0"/>
+          <w:numId w:val="902"/>
+        </w:numPr>
+        <w:contextualSpacing w:val="0"/>
+      </w:pPr>
+      <w:r>
+        <w:rPr>
+          <w:b/>
+          <w:i w:val="0"/>
+        </w:rPr>
+        <w:t xml:space="preserve">If Member Liable: </w:t>
+      </w:r>
+      <w:r>
+        <w:t>reverse the provisional credit from the member’s account.</w:t>
+      </w:r>
+    </w:p>
+    <w:p>
+      <w:pPr>
+        <w:pStyle w:val="ListParagraph"/>
+        <w:numPr>
+          <w:ilvl w:val="0"/>
+          <w:numId w:val="902"/>
+        </w:numPr>
+        <w:contextualSpacing w:val="0"/>
+      </w:pPr>
+      <w:r>
+        <w:rPr>
+          <w:b/>
+          <w:i w:val="0"/>
+        </w:rPr>
+        <w:t xml:space="preserve">If Issuer (Beem) Liable: </w:t>
+      </w:r>
+      <w:r>
+        <w:t>finalize the provisional credit in the member’s account.</w:t>
+      </w:r>
+    </w:p>
+    <w:p>
+      <w:pPr>
+        <w:pStyle w:val="ListParagraph"/>
+        <w:numPr>
+          <w:ilvl w:val="0"/>
+          <w:numId w:val="902"/>
+        </w:numPr>
+        <w:contextualSpacing w:val="0"/>
+      </w:pPr>
+      <w:r>
+        <w:rPr>
+          <w:b/>
+          <w:i w:val="0"/>
+        </w:rPr>
+        <w:t xml:space="preserve">If Acquirer Liable: </w:t>
+      </w:r>
+      <w:r>
+        <w:t>finalize the provisional credit in the member’s account.</w:t>
+      </w:r>
+    </w:p>
+    <w:p>
+      <w:pPr>
+        <w:pStyle w:val="Heading3"/>
+        <w:numPr>
+          <w:ilvl w:val="0"/>
+          <w:numId w:val="0"/>
+        </w:numPr>
+        <w:ind w:left="992" w:hanging="992"/>
+      </w:pPr>
+      <w:r>
+        <w:rPr>
+          <w:sz w:val="28"/>
+        </w:rPr>
+        <w:t>8.2.3 Close the Case</w:t>
+      </w:r>
+    </w:p>
+    <w:p>
+      <w:r>
+        <w:t>The Payment Services Team should then close the case by setting the CRM case status to “Closed”, which routes the case back to the Growth Team for final member communication.</w:t>
+      </w:r>
+    </w:p>
     <w:p>
       <w:pPr>
         <w:pStyle w:val="AppendixHeading1"/>
@@ -10597,6 +11365,42 @@
   </w:num>
   <w:num w:numId="32" w16cid:durableId="810369972">
     <w:abstractNumId w:val="3"/>
+  </w:num>
+  <w:num w:numId="900">
+    <w:abstractNumId w:val="26"/>
+    <w:lvlOverride w:ilvl="0">
+      <w:startOverride w:val="1"/>
+    </w:lvlOverride>
+    <w:lvlOverride w:ilvl="1">
+      <w:startOverride w:val="1"/>
+    </w:lvlOverride>
+    <w:lvlOverride w:ilvl="2">
+      <w:startOverride w:val="1"/>
+    </w:lvlOverride>
+  </w:num>
+  <w:num w:numId="901">
+    <w:abstractNumId w:val="26"/>
+    <w:lvlOverride w:ilvl="0">
+      <w:startOverride w:val="1"/>
+    </w:lvlOverride>
+    <w:lvlOverride w:ilvl="1">
+      <w:startOverride w:val="1"/>
+    </w:lvlOverride>
+    <w:lvlOverride w:ilvl="2">
+      <w:startOverride w:val="1"/>
+    </w:lvlOverride>
+  </w:num>
+  <w:num w:numId="902">
+    <w:abstractNumId w:val="26"/>
+    <w:lvlOverride w:ilvl="0">
+      <w:startOverride w:val="1"/>
+    </w:lvlOverride>
+    <w:lvlOverride w:ilvl="1">
+      <w:startOverride w:val="1"/>
+    </w:lvlOverride>
+    <w:lvlOverride w:ilvl="2">
+      <w:startOverride w:val="1"/>
+    </w:lvlOverride>
   </w:num>
   <w:numIdMacAtCleanup w:val="30"/>
 </w:numbering>

</xml_diff>

<commit_message>
Fold issuer certification requirements into the Section 7.2.2 dispute-cycle table
Per the Everlink guide, the Fraud and Non-Fraud cycles diverge: Fraud's
Pre-Arbitration Response requires Beem to certify contact-info mismatch and
cardholder review when the Acquirer supplies compelling evidence, while
Non-Fraud's Pre-Arbitration only requires Beem to certify the cardholder
still disputes the transaction if the Acquirer claims otherwise. Moved
these stage-specific obligations into the relevant table cells (replacing
the standalone Note, which only captured the Fraud side) so the table
accurately reflects what Beem must do at each stage for each dispute type.

Co-Authored-By: Claude Sonnet 5 <noreply@anthropic.com>
Claude-Session: https://claude.ai/code/session_01Msiz5p6hoKmmUHZyLJTkqb
</commit_message>
<xml_diff>
--- a/Dispute Resolution/DRAFT - Visa Debit Card Dispute Management Process.docx
+++ b/Dispute Resolution/DRAFT - Visa Debit Card Dispute Management Process.docx
@@ -5741,12 +5741,8 @@
             <w:tcW w:type="dxa" w:w="2340"/>
           </w:tcPr>
           <w:p>
-            <w:r/>
-            <w:r>
-              <w:rPr>
-                <w:b w:val="0"/>
-              </w:rPr>
-              <w:t>Acquirer provides evidence (may include compelling evidence)</w:t>
+            <w:r>
+              <w:t>Acquirer may provide compelling evidence supporting the transaction.</w:t>
             </w:r>
           </w:p>
         </w:tc>
@@ -5755,12 +5751,8 @@
             <w:tcW w:type="dxa" w:w="2340"/>
           </w:tcPr>
           <w:p>
-            <w:r/>
-            <w:r>
-              <w:rPr>
-                <w:b w:val="0"/>
-              </w:rPr>
-              <w:t>Issuer (Beem) addresses the Acquirer's dispute response</w:t>
+            <w:r>
+              <w:t>Beem (Issuer) may initiate if the dispute condition changes or new documentation is provided; if the Acquirer claims the cardholder no longer disputes, Beem must certify the cardholder continues to dispute.</w:t>
             </w:r>
           </w:p>
         </w:tc>
@@ -5769,12 +5761,8 @@
             <w:tcW w:type="dxa" w:w="2340"/>
           </w:tcPr>
           <w:p>
-            <w:r/>
-            <w:r>
-              <w:rPr>
-                <w:b w:val="0"/>
-              </w:rPr>
-              <w:t>30 calendar days</w:t>
+            <w:r>
+              <w:t>30 calendar days (Fraud); a Non-Fraud decline of the Acquirer’s evidence must reach Everlink within 10 business days of receipt)</w:t>
             </w:r>
           </w:p>
         </w:tc>
@@ -5799,12 +5787,8 @@
             <w:tcW w:type="dxa" w:w="2340"/>
           </w:tcPr>
           <w:p>
-            <w:r/>
-            <w:r>
-              <w:rPr>
-                <w:b w:val="0"/>
-              </w:rPr>
-              <w:t>Issuer (Beem) accepts financial responsibility or declines the evidence</w:t>
+            <w:r>
+              <w:t>Beem (Issuer) accepts financial responsibility or declines the evidence. If the Acquirer supplied compelling evidence, Beem must certify: (a) the contact information provided does not match the cardholder’s records; and (b) Beem has contacted the cardholder to review the evidence and explain why they continue to dispute.</w:t>
             </w:r>
           </w:p>
         </w:tc>
@@ -5813,12 +5797,8 @@
             <w:tcW w:type="dxa" w:w="2340"/>
           </w:tcPr>
           <w:p>
-            <w:r/>
-            <w:r>
-              <w:rPr>
-                <w:b w:val="0"/>
-              </w:rPr>
-              <w:t>Acquirer accepts financial responsibility or declines</w:t>
+            <w:r>
+              <w:t>Acquirer accepts financial responsibility or declines the pre-arbitration.</w:t>
             </w:r>
           </w:p>
         </w:tc>
@@ -5827,12 +5807,8 @@
             <w:tcW w:type="dxa" w:w="2340"/>
           </w:tcPr>
           <w:p>
-            <w:r/>
-            <w:r>
-              <w:rPr>
-                <w:b w:val="0"/>
-              </w:rPr>
-              <w:t>30 calendar days (a decline must reach Everlink within 10 business days of receipt of the proof)</w:t>
+            <w:r>
+              <w:t>30 calendar days (a Fraud decline must reach Everlink within 10 business days of receipt of the proof)</w:t>
             </w:r>
           </w:p>
         </w:tc>
@@ -5857,12 +5833,8 @@
             <w:tcW w:type="dxa" w:w="2340"/>
           </w:tcPr>
           <w:p>
-            <w:r/>
-            <w:r>
-              <w:rPr>
-                <w:b w:val="0"/>
-              </w:rPr>
-              <w:t>Acquirer may escalate to Visa</w:t>
+            <w:r>
+              <w:t>Acquirer may escalate to Visa.</w:t>
             </w:r>
           </w:p>
         </w:tc>
@@ -5871,12 +5843,8 @@
             <w:tcW w:type="dxa" w:w="2340"/>
           </w:tcPr>
           <w:p>
-            <w:r/>
-            <w:r>
-              <w:rPr>
-                <w:b w:val="0"/>
-              </w:rPr>
-              <w:t>Issuer (Beem) may escalate to Visa</w:t>
+            <w:r>
+              <w:t>Beem (Issuer) may escalate to Visa if the cycle is complete, Beem remains unresolved, and the Acquirer did not meet the Visa Rules requirements.</w:t>
             </w:r>
           </w:p>
         </w:tc>
@@ -5885,33 +5853,13 @@
             <w:tcW w:type="dxa" w:w="2340"/>
           </w:tcPr>
           <w:p>
-            <w:r/>
-            <w:r>
-              <w:rPr>
-                <w:b w:val="0"/>
-              </w:rPr>
+            <w:r>
               <w:t>10 calendar days</w:t>
             </w:r>
           </w:p>
         </w:tc>
       </w:tr>
     </w:tbl>
-    <w:p>
-      <w:r>
-        <w:rPr>
-          <w:b/>
-          <w:i/>
-        </w:rPr>
-        <w:t xml:space="preserve">Note — Compelling Evidence: </w:t>
-      </w:r>
-      <w:r>
-        <w:rPr>
-          <w:b w:val="0"/>
-          <w:i/>
-        </w:rPr>
-        <w:t>if the Acquirer provides compelling evidence in support of a Pre-Arbitration Attempt, and the Fraud Prevention Department or Payment Services Team decides to continue disputing the transaction (decline the evidence), they must contact the cardholder to review the evidence, and certify that (a) the contact information provided does not match the cardholder’s information on record, and (b) the cardholder has been contacted and continues to dispute the transaction.</w:t>
-      </w:r>
-    </w:p>
     <w:p>
       <w:r>
         <w:t>Once the network submission and response cycle concludes (e.g., the Acquirer accepts the dispute, Beem accepts the Acquirer’s response, or an Arbitration ruling is received), determine whether liability rests with Beem (the Issuer), the member, or the Acquirer, and proceed to Section 8 — Stage 5: Resolution &amp; Recovery.</w:t>

</xml_diff>

<commit_message>
Simplify Section 7.2.1 to a single role-neutral submission sentence
Replaces the separate Fraud/Non-Fraud bullets with one sentence covering
both the Payment Services Team member and Fraud Specialist, and names the
Central 1 ServiceNow platform as the submission channel for the ATM/POS
Trace.

Co-Authored-By: Claude Sonnet 5 <noreply@anthropic.com>
Claude-Session: https://claude.ai/code/session_01Msiz5p6hoKmmUHZyLJTkqb
</commit_message>
<xml_diff>
--- a/Dispute Resolution/DRAFT - Visa Debit Card Dispute Management Process.docx
+++ b/Dispute Resolution/DRAFT - Visa Debit Card Dispute Management Process.docx
@@ -5450,63 +5450,16 @@
     </w:p>
     <w:p>
       <w:r>
-        <w:t>Once the case has met the applicable network submission requirements (see Section 6.2.4), the dispute should be submitted to Central 1 for onward submission to Visa:</w:t>
-      </w:r>
-    </w:p>
-    <w:p>
-      <w:pPr>
-        <w:pStyle w:val="ListParagraph"/>
-        <w:numPr>
-          <w:ilvl w:val="0"/>
-          <w:numId w:val="900"/>
-        </w:numPr>
-        <w:contextualSpacing w:val="0"/>
-      </w:pPr>
-      <w:r>
-        <w:rPr>
-          <w:b/>
-          <w:i w:val="0"/>
-        </w:rPr>
-        <w:t xml:space="preserve">Fraud Prevention Department: </w:t>
-      </w:r>
-      <w:r>
-        <w:t>submit fraudulent disputes to Central 1.</w:t>
-      </w:r>
-    </w:p>
-    <w:p>
-      <w:pPr>
-        <w:pStyle w:val="ListParagraph"/>
-        <w:numPr>
-          <w:ilvl w:val="0"/>
-          <w:numId w:val="900"/>
-        </w:numPr>
-        <w:contextualSpacing w:val="0"/>
-      </w:pPr>
-      <w:r>
-        <w:rPr>
-          <w:b/>
-          <w:i w:val="0"/>
-        </w:rPr>
-        <w:t xml:space="preserve">Payment Services Team: </w:t>
-      </w:r>
-      <w:r>
-        <w:t>submit non-fraudulent disputes to Central 1.</w:t>
-      </w:r>
-    </w:p>
-    <w:p>
-      <w:r>
-        <w:rPr>
-          <w:b w:val="0"/>
+        <w:t xml:space="preserve">Once the case has met the applicable network submission requirements (see Section 6.2.4), the Payment Services Team member or Fraud Specialist should complete an ATM/POS Trace via Central 1’s ServiceNow platform to submit the dispute to Central 1. </w:t>
+      </w:r>
+      <w:r>
+        <w:rPr>
           <w:i/>
         </w:rPr>
-        <w:t xml:space="preserve">Please refer to the Current Process — How to Initiate an ATM &amp; POS Trace </w:t>
-      </w:r>
-      <w:r>
-        <w:rPr>
-          <w:b w:val="0"/>
-          <w:i w:val="0"/>
-        </w:rPr>
-        <w:t>for detailed guidance on completing the submission form.</w:t>
+        <w:t>Please refer to the Current Process — How to Initiate an ATM &amp; POS Trace</w:t>
+      </w:r>
+      <w:r>
+        <w:t xml:space="preserve"> for detailed guidance on completing the submission form.</w:t>
       </w:r>
     </w:p>
     <w:p>

</xml_diff>

<commit_message>
Restructure Section 7.2.2 dispute-cycle table to two columns (Fraud / Non-Fraud)
Replaces the 4-column Step/Fraud/Non-Fraud/Timeframe layout with a simple
2-column comparison: each column is a self-contained numbered sequence for
that dispute type, with its timeframe folded into each step, so the table
reads top-to-bottom per column instead of across a sparsely-populated row
structure.

Co-Authored-By: Claude Sonnet 5 <noreply@anthropic.com>
Claude-Session: https://claude.ai/code/session_01Msiz5p6hoKmmUHZyLJTkqb
</commit_message>
<xml_diff>
--- a/Dispute Resolution/DRAFT - Visa Debit Card Dispute Management Process.docx
+++ b/Dispute Resolution/DRAFT - Visa Debit Card Dispute Management Process.docx
@@ -5495,15 +5495,13 @@
         <w:tblLook w:firstColumn="1" w:firstRow="1" w:lastColumn="0" w:lastRow="0" w:noHBand="0" w:noVBand="1" w:val="04A0"/>
       </w:tblPr>
       <w:tblGrid>
-        <w:gridCol w:w="2340"/>
-        <w:gridCol w:w="2340"/>
-        <w:gridCol w:w="2340"/>
-        <w:gridCol w:w="2340"/>
+        <w:gridCol w:w="4680"/>
+        <w:gridCol w:w="4680"/>
       </w:tblGrid>
       <w:tr>
         <w:tc>
           <w:tcPr>
-            <w:tcW w:type="dxa" w:w="2340"/>
+            <w:tcW w:type="dxa" w:w="4680"/>
           </w:tcPr>
           <w:p>
             <w:r/>
@@ -5511,27 +5509,13 @@
               <w:rPr>
                 <w:b/>
               </w:rPr>
-              <w:t>Step</w:t>
+              <w:t>Fraud (Dispute Category 10)</w:t>
             </w:r>
           </w:p>
         </w:tc>
         <w:tc>
           <w:tcPr>
-            <w:tcW w:type="dxa" w:w="2340"/>
-          </w:tcPr>
-          <w:p>
-            <w:r/>
-            <w:r>
-              <w:rPr>
-                <w:b/>
-              </w:rPr>
-              <w:t>Fraud (Dispute Category 10)</w:t>
-            </w:r>
-          </w:p>
-        </w:tc>
-        <w:tc>
-          <w:tcPr>
-            <w:tcW w:type="dxa" w:w="2340"/>
+            <w:tcW w:type="dxa" w:w="4680"/>
           </w:tcPr>
           <w:p>
             <w:r/>
@@ -5540,20 +5524,6 @@
                 <w:b/>
               </w:rPr>
               <w:t>Non-Fraud (Dispute Category 12/13)</w:t>
-            </w:r>
-          </w:p>
-        </w:tc>
-        <w:tc>
-          <w:tcPr>
-            <w:tcW w:type="dxa" w:w="2340"/>
-          </w:tcPr>
-          <w:p>
-            <w:r/>
-            <w:r>
-              <w:rPr>
-                <w:b/>
-              </w:rPr>
-              <w:t>Timeframe</w:t>
             </w:r>
           </w:p>
         </w:tc>
@@ -5561,253 +5531,227 @@
       <w:tr>
         <w:tc>
           <w:tcPr>
-            <w:tcW w:type="dxa" w:w="2340"/>
+            <w:tcW w:type="dxa" w:w="4680"/>
           </w:tcPr>
           <w:p>
-            <w:r/>
+            <w:pPr>
+              <w:numPr>
+                <w:ilvl w:val="0"/>
+                <w:numId w:val="950"/>
+              </w:numPr>
+              <w:contextualSpacing w:val="0"/>
+            </w:pPr>
             <w:r>
               <w:rPr>
-                <w:b w:val="0"/>
+                <w:b/>
               </w:rPr>
-              <w:t>1. Dispute</w:t>
+              <w:t xml:space="preserve">Dispute: </w:t>
+            </w:r>
+            <w:r>
+              <w:t xml:space="preserve">Beem (Issuer) files the dispute. </w:t>
+            </w:r>
+            <w:r>
+              <w:rPr>
+                <w:i/>
+              </w:rPr>
+              <w:t>(completed in Section 7.2.1)</w:t>
+            </w:r>
+          </w:p>
+          <w:p>
+            <w:pPr>
+              <w:numPr>
+                <w:ilvl w:val="0"/>
+                <w:numId w:val="950"/>
+              </w:numPr>
+              <w:contextualSpacing w:val="0"/>
+            </w:pPr>
+            <w:r>
+              <w:rPr>
+                <w:b/>
+              </w:rPr>
+              <w:t xml:space="preserve">Pre-Arbitration: </w:t>
+            </w:r>
+            <w:r>
+              <w:t xml:space="preserve">Acquirer may provide compelling evidence supporting the transaction. </w:t>
+            </w:r>
+            <w:r>
+              <w:rPr>
+                <w:i/>
+              </w:rPr>
+              <w:t>(30 calendar days)</w:t>
+            </w:r>
+          </w:p>
+          <w:p>
+            <w:pPr>
+              <w:numPr>
+                <w:ilvl w:val="0"/>
+                <w:numId w:val="950"/>
+              </w:numPr>
+              <w:contextualSpacing w:val="0"/>
+            </w:pPr>
+            <w:r>
+              <w:rPr>
+                <w:b/>
+              </w:rPr>
+              <w:t xml:space="preserve">Pre-Arbitration Response: </w:t>
+            </w:r>
+            <w:r>
+              <w:t xml:space="preserve">Beem (Issuer) accepts financial responsibility or declines the evidence. If the Acquirer supplied compelling evidence, Beem must certify: (a) the contact information provided does not match the cardholder’s records; and (b) Beem has contacted the cardholder to review the evidence and explain why they continue to dispute. </w:t>
+            </w:r>
+            <w:r>
+              <w:rPr>
+                <w:i/>
+              </w:rPr>
+              <w:t>(30 calendar days; a decline must reach Everlink within 10 business days of receipt of the proof)</w:t>
+            </w:r>
+          </w:p>
+          <w:p>
+            <w:pPr>
+              <w:numPr>
+                <w:ilvl w:val="0"/>
+                <w:numId w:val="950"/>
+              </w:numPr>
+              <w:contextualSpacing w:val="0"/>
+            </w:pPr>
+            <w:r>
+              <w:rPr>
+                <w:b/>
+              </w:rPr>
+              <w:t xml:space="preserve">Arbitration: </w:t>
+            </w:r>
+            <w:r>
+              <w:t xml:space="preserve">Acquirer may escalate to Visa. </w:t>
+            </w:r>
+            <w:r>
+              <w:rPr>
+                <w:i/>
+              </w:rPr>
+              <w:t>(10 calendar days)</w:t>
             </w:r>
           </w:p>
         </w:tc>
         <w:tc>
           <w:tcPr>
-            <w:tcW w:type="dxa" w:w="2340"/>
+            <w:tcW w:type="dxa" w:w="4680"/>
           </w:tcPr>
           <w:p>
-            <w:r/>
+            <w:pPr>
+              <w:numPr>
+                <w:ilvl w:val="0"/>
+                <w:numId w:val="951"/>
+              </w:numPr>
+              <w:contextualSpacing w:val="0"/>
+            </w:pPr>
             <w:r>
               <w:rPr>
-                <w:b w:val="0"/>
+                <w:b/>
               </w:rPr>
-              <w:t>Issuer (Beem) files the dispute</w:t>
+              <w:t xml:space="preserve">Dispute: </w:t>
+            </w:r>
+            <w:r>
+              <w:t xml:space="preserve">Beem (Issuer) files the dispute. </w:t>
+            </w:r>
+            <w:r>
+              <w:rPr>
+                <w:i/>
+              </w:rPr>
+              <w:t>(completed in Section 7.2.1)</w:t>
             </w:r>
           </w:p>
-        </w:tc>
-        <w:tc>
-          <w:tcPr>
-            <w:tcW w:type="dxa" w:w="2340"/>
-          </w:tcPr>
           <w:p>
-            <w:r/>
+            <w:pPr>
+              <w:numPr>
+                <w:ilvl w:val="0"/>
+                <w:numId w:val="951"/>
+              </w:numPr>
+              <w:contextualSpacing w:val="0"/>
+            </w:pPr>
             <w:r>
               <w:rPr>
-                <w:b w:val="0"/>
+                <w:b/>
               </w:rPr>
-              <w:t>Issuer (Beem) files the dispute</w:t>
+              <w:t xml:space="preserve">Dispute Response: </w:t>
+            </w:r>
+            <w:r>
+              <w:t xml:space="preserve">Acquirer responds with evidence. </w:t>
+            </w:r>
+            <w:r>
+              <w:rPr>
+                <w:i/>
+              </w:rPr>
+              <w:t>(30 calendar days)</w:t>
             </w:r>
           </w:p>
-        </w:tc>
-        <w:tc>
-          <w:tcPr>
-            <w:tcW w:type="dxa" w:w="2340"/>
-          </w:tcPr>
           <w:p>
-            <w:r/>
+            <w:pPr>
+              <w:numPr>
+                <w:ilvl w:val="0"/>
+                <w:numId w:val="951"/>
+              </w:numPr>
+              <w:contextualSpacing w:val="0"/>
+            </w:pPr>
             <w:r>
               <w:rPr>
-                <w:b w:val="0"/>
+                <w:b/>
               </w:rPr>
-              <w:t>Completed in Section 7.2.1</w:t>
+              <w:t xml:space="preserve">Pre-Arbitration: </w:t>
+            </w:r>
+            <w:r>
+              <w:t xml:space="preserve">Beem (Issuer) may initiate if the dispute condition changes or new documentation is provided; if the Acquirer claims the cardholder no longer disputes, Beem must certify the cardholder continues to dispute. </w:t>
+            </w:r>
+            <w:r>
+              <w:rPr>
+                <w:i/>
+              </w:rPr>
+              <w:t>(a decline of the Acquirer’s evidence must reach Everlink within 10 business days of receipt)</w:t>
             </w:r>
           </w:p>
-        </w:tc>
-      </w:tr>
-      <w:tr>
-        <w:tc>
-          <w:tcPr>
-            <w:tcW w:type="dxa" w:w="2340"/>
-          </w:tcPr>
           <w:p>
-            <w:r/>
+            <w:pPr>
+              <w:numPr>
+                <w:ilvl w:val="0"/>
+                <w:numId w:val="951"/>
+              </w:numPr>
+              <w:contextualSpacing w:val="0"/>
+            </w:pPr>
             <w:r>
               <w:rPr>
-                <w:b w:val="0"/>
+                <w:b/>
               </w:rPr>
-              <w:t>2. Dispute Response</w:t>
+              <w:t xml:space="preserve">Pre-Arbitration Response: </w:t>
+            </w:r>
+            <w:r>
+              <w:t xml:space="preserve">Acquirer accepts financial responsibility or declines the pre-arbitration. </w:t>
+            </w:r>
+            <w:r>
+              <w:rPr>
+                <w:i/>
+              </w:rPr>
+              <w:t>(30 calendar days)</w:t>
             </w:r>
           </w:p>
-        </w:tc>
-        <w:tc>
-          <w:tcPr>
-            <w:tcW w:type="dxa" w:w="2340"/>
-          </w:tcPr>
           <w:p>
-            <w:r/>
+            <w:pPr>
+              <w:numPr>
+                <w:ilvl w:val="0"/>
+                <w:numId w:val="951"/>
+              </w:numPr>
+              <w:contextualSpacing w:val="0"/>
+            </w:pPr>
             <w:r>
               <w:rPr>
-                <w:b w:val="0"/>
+                <w:b/>
               </w:rPr>
-              <w:t>N/A</w:t>
-            </w:r>
-          </w:p>
-        </w:tc>
-        <w:tc>
-          <w:tcPr>
-            <w:tcW w:type="dxa" w:w="2340"/>
-          </w:tcPr>
-          <w:p>
-            <w:r/>
+              <w:t xml:space="preserve">Arbitration: </w:t>
+            </w:r>
+            <w:r>
+              <w:t xml:space="preserve">Beem (Issuer) may escalate to Visa if the cycle is complete, Beem remains unresolved, and the Acquirer did not meet the Visa Rules requirements. </w:t>
+            </w:r>
             <w:r>
               <w:rPr>
-                <w:b w:val="0"/>
+                <w:i/>
               </w:rPr>
-              <w:t>Acquirer responds with evidence</w:t>
-            </w:r>
-          </w:p>
-        </w:tc>
-        <w:tc>
-          <w:tcPr>
-            <w:tcW w:type="dxa" w:w="2340"/>
-          </w:tcPr>
-          <w:p>
-            <w:r/>
-            <w:r>
-              <w:rPr>
-                <w:b w:val="0"/>
-              </w:rPr>
-              <w:t>30 calendar days</w:t>
-            </w:r>
-          </w:p>
-        </w:tc>
-      </w:tr>
-      <w:tr>
-        <w:tc>
-          <w:tcPr>
-            <w:tcW w:type="dxa" w:w="2340"/>
-          </w:tcPr>
-          <w:p>
-            <w:r/>
-            <w:r>
-              <w:rPr>
-                <w:b w:val="0"/>
-              </w:rPr>
-              <w:t>3. Pre-Arbitration</w:t>
-            </w:r>
-          </w:p>
-        </w:tc>
-        <w:tc>
-          <w:tcPr>
-            <w:tcW w:type="dxa" w:w="2340"/>
-          </w:tcPr>
-          <w:p>
-            <w:r>
-              <w:t>Acquirer may provide compelling evidence supporting the transaction.</w:t>
-            </w:r>
-          </w:p>
-        </w:tc>
-        <w:tc>
-          <w:tcPr>
-            <w:tcW w:type="dxa" w:w="2340"/>
-          </w:tcPr>
-          <w:p>
-            <w:r>
-              <w:t>Beem (Issuer) may initiate if the dispute condition changes or new documentation is provided; if the Acquirer claims the cardholder no longer disputes, Beem must certify the cardholder continues to dispute.</w:t>
-            </w:r>
-          </w:p>
-        </w:tc>
-        <w:tc>
-          <w:tcPr>
-            <w:tcW w:type="dxa" w:w="2340"/>
-          </w:tcPr>
-          <w:p>
-            <w:r>
-              <w:t>30 calendar days (Fraud); a Non-Fraud decline of the Acquirer’s evidence must reach Everlink within 10 business days of receipt)</w:t>
-            </w:r>
-          </w:p>
-        </w:tc>
-      </w:tr>
-      <w:tr>
-        <w:tc>
-          <w:tcPr>
-            <w:tcW w:type="dxa" w:w="2340"/>
-          </w:tcPr>
-          <w:p>
-            <w:r/>
-            <w:r>
-              <w:rPr>
-                <w:b w:val="0"/>
-              </w:rPr>
-              <w:t>4. Pre-Arbitration Response</w:t>
-            </w:r>
-          </w:p>
-        </w:tc>
-        <w:tc>
-          <w:tcPr>
-            <w:tcW w:type="dxa" w:w="2340"/>
-          </w:tcPr>
-          <w:p>
-            <w:r>
-              <w:t>Beem (Issuer) accepts financial responsibility or declines the evidence. If the Acquirer supplied compelling evidence, Beem must certify: (a) the contact information provided does not match the cardholder’s records; and (b) Beem has contacted the cardholder to review the evidence and explain why they continue to dispute.</w:t>
-            </w:r>
-          </w:p>
-        </w:tc>
-        <w:tc>
-          <w:tcPr>
-            <w:tcW w:type="dxa" w:w="2340"/>
-          </w:tcPr>
-          <w:p>
-            <w:r>
-              <w:t>Acquirer accepts financial responsibility or declines the pre-arbitration.</w:t>
-            </w:r>
-          </w:p>
-        </w:tc>
-        <w:tc>
-          <w:tcPr>
-            <w:tcW w:type="dxa" w:w="2340"/>
-          </w:tcPr>
-          <w:p>
-            <w:r>
-              <w:t>30 calendar days (a Fraud decline must reach Everlink within 10 business days of receipt of the proof)</w:t>
-            </w:r>
-          </w:p>
-        </w:tc>
-      </w:tr>
-      <w:tr>
-        <w:tc>
-          <w:tcPr>
-            <w:tcW w:type="dxa" w:w="2340"/>
-          </w:tcPr>
-          <w:p>
-            <w:r/>
-            <w:r>
-              <w:rPr>
-                <w:b w:val="0"/>
-              </w:rPr>
-              <w:t>5. Arbitration</w:t>
-            </w:r>
-          </w:p>
-        </w:tc>
-        <w:tc>
-          <w:tcPr>
-            <w:tcW w:type="dxa" w:w="2340"/>
-          </w:tcPr>
-          <w:p>
-            <w:r>
-              <w:t>Acquirer may escalate to Visa.</w:t>
-            </w:r>
-          </w:p>
-        </w:tc>
-        <w:tc>
-          <w:tcPr>
-            <w:tcW w:type="dxa" w:w="2340"/>
-          </w:tcPr>
-          <w:p>
-            <w:r>
-              <w:t>Beem (Issuer) may escalate to Visa if the cycle is complete, Beem remains unresolved, and the Acquirer did not meet the Visa Rules requirements.</w:t>
-            </w:r>
-          </w:p>
-        </w:tc>
-        <w:tc>
-          <w:tcPr>
-            <w:tcW w:type="dxa" w:w="2340"/>
-          </w:tcPr>
-          <w:p>
-            <w:r>
-              <w:t>10 calendar days</w:t>
+              <w:t>(10 calendar days)</w:t>
             </w:r>
           </w:p>
         </w:tc>
@@ -11300,6 +11244,18 @@
       <w:startOverride w:val="1"/>
     </w:lvlOverride>
     <w:lvlOverride w:ilvl="2">
+      <w:startOverride w:val="1"/>
+    </w:lvlOverride>
+  </w:num>
+  <w:num w:numId="950">
+    <w:abstractNumId w:val="5"/>
+    <w:lvlOverride w:ilvl="0">
+      <w:startOverride w:val="1"/>
+    </w:lvlOverride>
+  </w:num>
+  <w:num w:numId="951">
+    <w:abstractNumId w:val="5"/>
+    <w:lvlOverride w:ilvl="0">
       <w:startOverride w:val="1"/>
     </w:lvlOverride>
   </w:num>

</xml_diff>

<commit_message>
Rebuild Section 7.2.2 table as Step/Fraud/Non-Fraud, dropping the Timeframe column
Timing is folded into each cell, but only where Beem (Issuer) is the actor:
Fraud's Pre-Arbitration and Non-Fraud's Dispute Response are Acquirer-only
steps and carry no deadline, while Fraud's Pre-Arbitration Response and
Non-Fraud's Pre-Arbitration/Arbitration (Beem-driven steps) keep their
timeframes and Everlink decline deadlines.

Co-Authored-By: Claude Sonnet 5 <noreply@anthropic.com>
Claude-Session: https://claude.ai/code/session_01Msiz5p6hoKmmUHZyLJTkqb
</commit_message>
<xml_diff>
--- a/Dispute Resolution/DRAFT - Visa Debit Card Dispute Management Process.docx
+++ b/Dispute Resolution/DRAFT - Visa Debit Card Dispute Management Process.docx
@@ -5495,13 +5495,28 @@
         <w:tblLook w:firstColumn="1" w:firstRow="1" w:lastColumn="0" w:lastRow="0" w:noHBand="0" w:noVBand="1" w:val="04A0"/>
       </w:tblPr>
       <w:tblGrid>
-        <w:gridCol w:w="4680"/>
-        <w:gridCol w:w="4680"/>
+        <w:gridCol w:w="3120"/>
+        <w:gridCol w:w="3120"/>
+        <w:gridCol w:w="3120"/>
       </w:tblGrid>
       <w:tr>
         <w:tc>
           <w:tcPr>
-            <w:tcW w:type="dxa" w:w="4680"/>
+            <w:tcW w:type="dxa" w:w="3120"/>
+          </w:tcPr>
+          <w:p>
+            <w:r/>
+            <w:r>
+              <w:rPr>
+                <w:b/>
+              </w:rPr>
+              <w:t>Step</w:t>
+            </w:r>
+          </w:p>
+        </w:tc>
+        <w:tc>
+          <w:tcPr>
+            <w:tcW w:type="dxa" w:w="3120"/>
           </w:tcPr>
           <w:p>
             <w:r/>
@@ -5515,7 +5530,7 @@
         </w:tc>
         <w:tc>
           <w:tcPr>
-            <w:tcW w:type="dxa" w:w="4680"/>
+            <w:tcW w:type="dxa" w:w="3120"/>
           </w:tcPr>
           <w:p>
             <w:r/>
@@ -5531,227 +5546,219 @@
       <w:tr>
         <w:tc>
           <w:tcPr>
-            <w:tcW w:type="dxa" w:w="4680"/>
+            <w:tcW w:type="dxa" w:w="3120"/>
           </w:tcPr>
           <w:p>
-            <w:pPr>
-              <w:numPr>
-                <w:ilvl w:val="0"/>
-                <w:numId w:val="950"/>
-              </w:numPr>
-              <w:contextualSpacing w:val="0"/>
-            </w:pPr>
+            <w:r/>
             <w:r>
               <w:rPr>
-                <w:b/>
+                <w:b w:val="0"/>
               </w:rPr>
-              <w:t xml:space="preserve">Dispute: </w:t>
-            </w:r>
-            <w:r>
-              <w:t xml:space="preserve">Beem (Issuer) files the dispute. </w:t>
-            </w:r>
-            <w:r>
-              <w:rPr>
-                <w:i/>
-              </w:rPr>
-              <w:t>(completed in Section 7.2.1)</w:t>
-            </w:r>
-          </w:p>
-          <w:p>
-            <w:pPr>
-              <w:numPr>
-                <w:ilvl w:val="0"/>
-                <w:numId w:val="950"/>
-              </w:numPr>
-              <w:contextualSpacing w:val="0"/>
-            </w:pPr>
-            <w:r>
-              <w:rPr>
-                <w:b/>
-              </w:rPr>
-              <w:t xml:space="preserve">Pre-Arbitration: </w:t>
-            </w:r>
-            <w:r>
-              <w:t xml:space="preserve">Acquirer may provide compelling evidence supporting the transaction. </w:t>
-            </w:r>
-            <w:r>
-              <w:rPr>
-                <w:i/>
-              </w:rPr>
-              <w:t>(30 calendar days)</w:t>
-            </w:r>
-          </w:p>
-          <w:p>
-            <w:pPr>
-              <w:numPr>
-                <w:ilvl w:val="0"/>
-                <w:numId w:val="950"/>
-              </w:numPr>
-              <w:contextualSpacing w:val="0"/>
-            </w:pPr>
-            <w:r>
-              <w:rPr>
-                <w:b/>
-              </w:rPr>
-              <w:t xml:space="preserve">Pre-Arbitration Response: </w:t>
-            </w:r>
-            <w:r>
-              <w:t xml:space="preserve">Beem (Issuer) accepts financial responsibility or declines the evidence. If the Acquirer supplied compelling evidence, Beem must certify: (a) the contact information provided does not match the cardholder’s records; and (b) Beem has contacted the cardholder to review the evidence and explain why they continue to dispute. </w:t>
-            </w:r>
-            <w:r>
-              <w:rPr>
-                <w:i/>
-              </w:rPr>
-              <w:t>(30 calendar days; a decline must reach Everlink within 10 business days of receipt of the proof)</w:t>
-            </w:r>
-          </w:p>
-          <w:p>
-            <w:pPr>
-              <w:numPr>
-                <w:ilvl w:val="0"/>
-                <w:numId w:val="950"/>
-              </w:numPr>
-              <w:contextualSpacing w:val="0"/>
-            </w:pPr>
-            <w:r>
-              <w:rPr>
-                <w:b/>
-              </w:rPr>
-              <w:t xml:space="preserve">Arbitration: </w:t>
-            </w:r>
-            <w:r>
-              <w:t xml:space="preserve">Acquirer may escalate to Visa. </w:t>
-            </w:r>
-            <w:r>
-              <w:rPr>
-                <w:i/>
-              </w:rPr>
-              <w:t>(10 calendar days)</w:t>
+              <w:t>Dispute</w:t>
             </w:r>
           </w:p>
         </w:tc>
         <w:tc>
           <w:tcPr>
-            <w:tcW w:type="dxa" w:w="4680"/>
+            <w:tcW w:type="dxa" w:w="3120"/>
           </w:tcPr>
           <w:p>
-            <w:pPr>
-              <w:numPr>
-                <w:ilvl w:val="0"/>
-                <w:numId w:val="951"/>
-              </w:numPr>
-              <w:contextualSpacing w:val="0"/>
-            </w:pPr>
+            <w:r/>
             <w:r>
               <w:rPr>
-                <w:b/>
+                <w:b w:val="0"/>
               </w:rPr>
-              <w:t xml:space="preserve">Dispute: </w:t>
-            </w:r>
-            <w:r>
-              <w:t xml:space="preserve">Beem (Issuer) files the dispute. </w:t>
-            </w:r>
+              <w:t>Beem (Issuer) files the dispute. (Completed in Section 7.2.1)</w:t>
+            </w:r>
+          </w:p>
+        </w:tc>
+        <w:tc>
+          <w:tcPr>
+            <w:tcW w:type="dxa" w:w="3120"/>
+          </w:tcPr>
+          <w:p>
+            <w:r/>
             <w:r>
               <w:rPr>
-                <w:i/>
+                <w:b w:val="0"/>
               </w:rPr>
-              <w:t>(completed in Section 7.2.1)</w:t>
+              <w:t>Beem (Issuer) files the dispute. (Completed in Section 7.2.1)</w:t>
             </w:r>
           </w:p>
+        </w:tc>
+      </w:tr>
+      <w:tr>
+        <w:tc>
+          <w:tcPr>
+            <w:tcW w:type="dxa" w:w="3120"/>
+          </w:tcPr>
           <w:p>
-            <w:pPr>
-              <w:numPr>
-                <w:ilvl w:val="0"/>
-                <w:numId w:val="951"/>
-              </w:numPr>
-              <w:contextualSpacing w:val="0"/>
-            </w:pPr>
+            <w:r/>
             <w:r>
               <w:rPr>
-                <w:b/>
+                <w:b w:val="0"/>
               </w:rPr>
-              <w:t xml:space="preserve">Dispute Response: </w:t>
-            </w:r>
-            <w:r>
-              <w:t xml:space="preserve">Acquirer responds with evidence. </w:t>
-            </w:r>
+              <w:t>Dispute Response</w:t>
+            </w:r>
+          </w:p>
+        </w:tc>
+        <w:tc>
+          <w:tcPr>
+            <w:tcW w:type="dxa" w:w="3120"/>
+          </w:tcPr>
+          <w:p>
+            <w:r/>
             <w:r>
               <w:rPr>
-                <w:i/>
+                <w:b w:val="0"/>
               </w:rPr>
-              <w:t>(30 calendar days)</w:t>
+              <w:t>N/A — this step does not apply to Fraud disputes.</w:t>
             </w:r>
           </w:p>
+        </w:tc>
+        <w:tc>
+          <w:tcPr>
+            <w:tcW w:type="dxa" w:w="3120"/>
+          </w:tcPr>
           <w:p>
-            <w:pPr>
-              <w:numPr>
-                <w:ilvl w:val="0"/>
-                <w:numId w:val="951"/>
-              </w:numPr>
-              <w:contextualSpacing w:val="0"/>
-            </w:pPr>
+            <w:r/>
             <w:r>
               <w:rPr>
-                <w:b/>
+                <w:b w:val="0"/>
               </w:rPr>
-              <w:t xml:space="preserve">Pre-Arbitration: </w:t>
-            </w:r>
-            <w:r>
-              <w:t xml:space="preserve">Beem (Issuer) may initiate if the dispute condition changes or new documentation is provided; if the Acquirer claims the cardholder no longer disputes, Beem must certify the cardholder continues to dispute. </w:t>
-            </w:r>
+              <w:t>Acquirer responds with evidence.</w:t>
+            </w:r>
+          </w:p>
+        </w:tc>
+      </w:tr>
+      <w:tr>
+        <w:tc>
+          <w:tcPr>
+            <w:tcW w:type="dxa" w:w="3120"/>
+          </w:tcPr>
+          <w:p>
+            <w:r/>
             <w:r>
               <w:rPr>
-                <w:i/>
+                <w:b w:val="0"/>
               </w:rPr>
-              <w:t>(a decline of the Acquirer’s evidence must reach Everlink within 10 business days of receipt)</w:t>
+              <w:t>Pre-Arbitration</w:t>
             </w:r>
           </w:p>
+        </w:tc>
+        <w:tc>
+          <w:tcPr>
+            <w:tcW w:type="dxa" w:w="3120"/>
+          </w:tcPr>
           <w:p>
-            <w:pPr>
-              <w:numPr>
-                <w:ilvl w:val="0"/>
-                <w:numId w:val="951"/>
-              </w:numPr>
-              <w:contextualSpacing w:val="0"/>
-            </w:pPr>
+            <w:r/>
             <w:r>
               <w:rPr>
-                <w:b/>
+                <w:b w:val="0"/>
               </w:rPr>
-              <w:t xml:space="preserve">Pre-Arbitration Response: </w:t>
-            </w:r>
-            <w:r>
-              <w:t xml:space="preserve">Acquirer accepts financial responsibility or declines the pre-arbitration. </w:t>
-            </w:r>
+              <w:t>Acquirer may provide compelling evidence supporting the transaction.</w:t>
+            </w:r>
+          </w:p>
+        </w:tc>
+        <w:tc>
+          <w:tcPr>
+            <w:tcW w:type="dxa" w:w="3120"/>
+          </w:tcPr>
+          <w:p>
+            <w:r/>
             <w:r>
               <w:rPr>
-                <w:i/>
+                <w:b w:val="0"/>
               </w:rPr>
-              <w:t>(30 calendar days)</w:t>
+              <w:t>Beem (Issuer) may initiate if the dispute condition changes or new documentation is provided; if the Acquirer claims the cardholder no longer disputes, Beem must certify the cardholder continues to dispute. (A decline of the Acquirer’s evidence must reach Everlink within 10 business days of receipt.)</w:t>
             </w:r>
           </w:p>
+        </w:tc>
+      </w:tr>
+      <w:tr>
+        <w:tc>
+          <w:tcPr>
+            <w:tcW w:type="dxa" w:w="3120"/>
+          </w:tcPr>
           <w:p>
-            <w:pPr>
-              <w:numPr>
-                <w:ilvl w:val="0"/>
-                <w:numId w:val="951"/>
-              </w:numPr>
-              <w:contextualSpacing w:val="0"/>
-            </w:pPr>
+            <w:r/>
             <w:r>
               <w:rPr>
-                <w:b/>
+                <w:b w:val="0"/>
               </w:rPr>
-              <w:t xml:space="preserve">Arbitration: </w:t>
-            </w:r>
-            <w:r>
-              <w:t xml:space="preserve">Beem (Issuer) may escalate to Visa if the cycle is complete, Beem remains unresolved, and the Acquirer did not meet the Visa Rules requirements. </w:t>
-            </w:r>
+              <w:t>Pre-Arbitration Response</w:t>
+            </w:r>
+          </w:p>
+        </w:tc>
+        <w:tc>
+          <w:tcPr>
+            <w:tcW w:type="dxa" w:w="3120"/>
+          </w:tcPr>
+          <w:p>
+            <w:r/>
             <w:r>
               <w:rPr>
-                <w:i/>
+                <w:b w:val="0"/>
               </w:rPr>
-              <w:t>(10 calendar days)</w:t>
+              <w:t>Beem (Issuer) accepts financial responsibility or declines the evidence. If the Acquirer supplied compelling evidence, Beem must certify: (a) the contact information provided does not match the cardholder’s records; and (b) Beem has contacted the cardholder to review the evidence and explain why they continue to dispute. (Must respond within 30 calendar days of the Acquirer’s pre-arbitration attempt; a decline must reach Everlink within 10 business days of receipt of the proof.)</w:t>
+            </w:r>
+          </w:p>
+        </w:tc>
+        <w:tc>
+          <w:tcPr>
+            <w:tcW w:type="dxa" w:w="3120"/>
+          </w:tcPr>
+          <w:p>
+            <w:r/>
+            <w:r>
+              <w:rPr>
+                <w:b w:val="0"/>
+              </w:rPr>
+              <w:t>Acquirer accepts financial responsibility or declines the pre-arbitration.</w:t>
+            </w:r>
+          </w:p>
+        </w:tc>
+      </w:tr>
+      <w:tr>
+        <w:tc>
+          <w:tcPr>
+            <w:tcW w:type="dxa" w:w="3120"/>
+          </w:tcPr>
+          <w:p>
+            <w:r/>
+            <w:r>
+              <w:rPr>
+                <w:b w:val="0"/>
+              </w:rPr>
+              <w:t>Arbitration</w:t>
+            </w:r>
+          </w:p>
+        </w:tc>
+        <w:tc>
+          <w:tcPr>
+            <w:tcW w:type="dxa" w:w="3120"/>
+          </w:tcPr>
+          <w:p>
+            <w:r/>
+            <w:r>
+              <w:rPr>
+                <w:b w:val="0"/>
+              </w:rPr>
+              <w:t>Acquirer may escalate to Visa.</w:t>
+            </w:r>
+          </w:p>
+        </w:tc>
+        <w:tc>
+          <w:tcPr>
+            <w:tcW w:type="dxa" w:w="3120"/>
+          </w:tcPr>
+          <w:p>
+            <w:r/>
+            <w:r>
+              <w:rPr>
+                <w:b w:val="0"/>
+              </w:rPr>
+              <w:t>Beem (Issuer) may escalate to Visa if the cycle is complete, Beem remains unresolved, and the Acquirer did not meet the Visa Rules requirements. (Must be filed within 10 calendar days of the Acquirer’s pre-arbitration response.)</w:t>
             </w:r>
           </w:p>
         </w:tc>

</xml_diff>

<commit_message>
Simplify Section 7.2.2 table cells and rewrite Stage 5 for clearer role hand-offs
Table: tightened the Fraud/Non-Fraud Pre-Arbitration and Pre-Arbitration
Response cells so the Everlink certification requirements read as one
accept-or-decline choice per cell, with the certification trigger and
Everlink decline deadline tied directly to the decline branch.

Section 8: 8.2.1 now states the three liability outcomes up front, then
gives each role (Fraud Specialist vs. Payment Services Team) an explicit
CRM-recording step and a "proceed to Section X" hand-off, so either role
can follow its own path end-to-end. Added the matching "proceed to 8.2.3"
transition after 8.2.2 and a "This procedure ends" closer on 8.2.3.

Co-Authored-By: Claude Sonnet 5 <noreply@anthropic.com>
Claude-Session: https://claude.ai/code/session_01Msiz5p6hoKmmUHZyLJTkqb
</commit_message>
<xml_diff>
--- a/Dispute Resolution/DRAFT - Visa Debit Card Dispute Management Process.docx
+++ b/Dispute Resolution/DRAFT - Visa Debit Card Dispute Management Process.docx
@@ -5651,11 +5651,7 @@
             <w:tcW w:type="dxa" w:w="3120"/>
           </w:tcPr>
           <w:p>
-            <w:r/>
-            <w:r>
-              <w:rPr>
-                <w:b w:val="0"/>
-              </w:rPr>
+            <w:r>
               <w:t>Acquirer may provide compelling evidence supporting the transaction.</w:t>
             </w:r>
           </w:p>
@@ -5665,12 +5661,8 @@
             <w:tcW w:type="dxa" w:w="3120"/>
           </w:tcPr>
           <w:p>
-            <w:r/>
-            <w:r>
-              <w:rPr>
-                <w:b w:val="0"/>
-              </w:rPr>
-              <w:t>Beem (Issuer) may initiate if the dispute condition changes or new documentation is provided; if the Acquirer claims the cardholder no longer disputes, Beem must certify the cardholder continues to dispute. (A decline of the Acquirer’s evidence must reach Everlink within 10 business days of receipt.)</w:t>
+            <w:r>
+              <w:t>Beem accepts the Acquirer’s response or declines it to continue disputing — because the dispute condition changed, new documentation is available, or (if the Acquirer claimed the cardholder no longer disputes) Beem certifies the cardholder still disputes the transaction. (A decline must reach Everlink within 10 business days.)</w:t>
             </w:r>
           </w:p>
         </w:tc>
@@ -5695,12 +5687,8 @@
             <w:tcW w:type="dxa" w:w="3120"/>
           </w:tcPr>
           <w:p>
-            <w:r/>
-            <w:r>
-              <w:rPr>
-                <w:b w:val="0"/>
-              </w:rPr>
-              <w:t>Beem (Issuer) accepts financial responsibility or declines the evidence. If the Acquirer supplied compelling evidence, Beem must certify: (a) the contact information provided does not match the cardholder’s records; and (b) Beem has contacted the cardholder to review the evidence and explain why they continue to dispute. (Must respond within 30 calendar days of the Acquirer’s pre-arbitration attempt; a decline must reach Everlink within 10 business days of receipt of the proof.)</w:t>
+            <w:r>
+              <w:t>Beem accepts financial responsibility or declines the evidence. If compelling evidence was supplied and Beem declines it (continues disputing), Beem must certify that: 1. the contact information the merchant provided doesn’t match the cardholder’s records; and 2. it has contacted the cardholder, who still disputes the transaction, and provide an explanation why. (A decline must reach Everlink within 10 business days.)</w:t>
             </w:r>
           </w:p>
         </w:tc>
@@ -5709,12 +5697,8 @@
             <w:tcW w:type="dxa" w:w="3120"/>
           </w:tcPr>
           <w:p>
-            <w:r/>
-            <w:r>
-              <w:rPr>
-                <w:b w:val="0"/>
-              </w:rPr>
-              <w:t>Acquirer accepts financial responsibility or declines the pre-arbitration.</w:t>
+            <w:r>
+              <w:t>Acquirer accepts or declines the pre-arbitration.</w:t>
             </w:r>
           </w:p>
         </w:tc>
@@ -5753,12 +5737,8 @@
             <w:tcW w:type="dxa" w:w="3120"/>
           </w:tcPr>
           <w:p>
-            <w:r/>
-            <w:r>
-              <w:rPr>
-                <w:b w:val="0"/>
-              </w:rPr>
-              <w:t>Beem (Issuer) may escalate to Visa if the cycle is complete, Beem remains unresolved, and the Acquirer did not meet the Visa Rules requirements. (Must be filed within 10 calendar days of the Acquirer’s pre-arbitration response.)</w:t>
+            <w:r>
+              <w:t>Beem may escalate the unresolved dispute to Visa. (Within 10 calendar days of the Acquirer’s response.)</w:t>
             </w:r>
           </w:p>
         </w:tc>
@@ -5831,7 +5811,7 @@
     </w:p>
     <w:p>
       <w:r>
-        <w:t>Once the network submission and response cycle has concluded (see Section 7.2.2), the Fraud Prevention Department or Payment Services Team should record the final outcome of the dispute in the CRM case notes. There are three possible outcomes:</w:t>
+        <w:t>Once the network submission and response cycle has concluded (see Section 7.2.2), the Fraud Specialist or Payment Services Team member should determine the final outcome of the dispute:</w:t>
       </w:r>
     </w:p>
     <w:p>
@@ -5896,14 +5876,45 @@
     </w:p>
     <w:p>
       <w:r>
+        <w:t>Based on the determined outcome:</w:t>
+      </w:r>
+    </w:p>
+    <w:p>
+      <w:pPr>
+        <w:pStyle w:val="ListParagraph"/>
+        <w:numPr>
+          <w:ilvl w:val="0"/>
+          <w:numId w:val="901"/>
+        </w:numPr>
+        <w:contextualSpacing w:val="0"/>
+      </w:pPr>
+      <w:r>
         <w:rPr>
           <w:b/>
-          <w:i w:val="0"/>
-        </w:rPr>
-        <w:t xml:space="preserve">Fraud Prevention Department: </w:t>
-      </w:r>
-      <w:r>
-        <w:t>once the outcome is recorded, route the case to the Payment Services Team to finalize or reverse the provisional credit.</w:t>
+        </w:rPr>
+        <w:t xml:space="preserve">Fraud Specialist: </w:t>
+      </w:r>
+      <w:r>
+        <w:t>record the final outcome of the dispute in the CRM case notes, then route the case to the Payment Services Team, who will proceed to Section 8.2.2 — Finalize or Reverse the Provisional Credit.</w:t>
+      </w:r>
+    </w:p>
+    <w:p>
+      <w:pPr>
+        <w:pStyle w:val="ListParagraph"/>
+        <w:numPr>
+          <w:ilvl w:val="0"/>
+          <w:numId w:val="901"/>
+        </w:numPr>
+        <w:contextualSpacing w:val="0"/>
+      </w:pPr>
+      <w:r>
+        <w:rPr>
+          <w:b/>
+        </w:rPr>
+        <w:t xml:space="preserve">Payment Services Team: </w:t>
+      </w:r>
+      <w:r>
+        <w:t>record the final outcome of the dispute in the CRM case notes, then proceed to Section 8.2.2 — Finalize or Reverse the Provisional Credit.</w:t>
       </w:r>
     </w:p>
     <w:p>
@@ -5988,6 +5999,12 @@
       </w:r>
     </w:p>
     <w:p>
+      <w:pPr/>
+      <w:r>
+        <w:t>Once complete, proceed to Section 8.2.3 — Close the Case.</w:t>
+      </w:r>
+    </w:p>
+    <w:p>
       <w:pPr>
         <w:pStyle w:val="Heading3"/>
         <w:numPr>
@@ -6006,6 +6023,9 @@
     <w:p>
       <w:r>
         <w:t>The Payment Services Team should then close the case by setting the CRM case status to “Closed”, which routes the case back to the Growth Team for final member communication.</w:t>
+      </w:r>
+      <w:r>
+        <w:t xml:space="preserve"> This procedure ends.</w:t>
       </w:r>
     </w:p>
     <w:p>

</xml_diff>